<commit_message>
Deploy AMG ecosystem · 2026-04-24 13:26
- Portal público (home, artículos, detección, para-médicos)
- Hub de revisión sistema_piezas_AMG_Hub.html con sidebar Dreamweaver
- Visita Médica PWA (visita-medica-amg/) — 3 ciclos + 4 interactivos offline
- Corpus visual HUB_AMG_PYLORI/ (brand_amg + brand_kicab)
- Documentos ejecutivos (.docx maestro, .xlsx métricas, .pptx pitch)

Firebase RTDB sync: polar-amg-hub-2026 (compartido entre hub y VM)
Org: polar-multimedia · github.com/polar-multimedia/amg-pylori-hub
</commit_message>
<xml_diff>
--- a/Documento_Maestro_AMG_2026.docx
+++ b/Documento_Maestro_AMG_2026.docx
@@ -152,7 +152,7 @@
           <w:color w:val="2C2C2C"/>
           <w:sz w:val="21"/>
         </w:rPr>
-        <w:t>Este documento describe el sistema integral de comunicación y detección para la campaña "México Sin Cáncer Gástrico 2026", avalada por la Asociación Mexicana de Gastroenterología (AMG) y desarrollada por Polar Multimedia para Carnot Laboratorios. El sistema articula cinco capas interdependientes — estrategia, producción, revisión, distribución y medición — donde la inteligencia artificial actúa como capa de amplificación transversal, y los influencers médicos operan como capa de credibilidad orgánica en la comunidad de profesionales de la salud.</w:t>
+        <w:t>Este documento describe el sistema integral de comunicación y detección para la campaña "México Sin Cáncer Gástrico 2026", avalada por la Asociación Mexicana de Gastroenterología (AMG) y desarrollada por Polar Multimedia para Carnot Laboratorios. El sistema no es una campaña con fecha de caducidad: es un esfuerzo continuo de construcción de comunidad en torno al portal mexicosincancergastrico.com.mx, apalancado institucionalmente por el aval de la AMG. Cada ciclo mensual añade nuevos visitantes al sitio, los convierte en usuarios registrados, y los mantiene dentro de una comunidad educada que regresa mes con mes por contenido nuevo, referencias clínicas actualizadas y experiencias interactivas.</w:t>
       </w:r>
     </w:p>
     <w:p>
@@ -168,7 +168,7 @@
           <w:color w:val="2C2C2C"/>
           <w:sz w:val="21"/>
         </w:rPr>
-        <w:t>El alcance operativo del sistema cubre ocho ciclos mensuales (mayo a diciembre de 2026), 150 representantes de fuerza de ventas con tablets Android, un portal público abierto al paciente, un hub interno de revisión colaborativa, y un pool de KOLs médicos seleccionados por Polar y AMG. La amplificación por IA se traduce en 35 semanas de calendario editorial producidas en días en lugar de meses, con coherencia de canon visual garantizada y compliance pharma verificada en cadena de custodia.</w:t>
+        <w:t>El sistema articula cinco capas interdependientes — estrategia, producción, revisión, distribución y medición — donde la inteligencia artificial actúa como capa de amplificación transversal, y los influencers médicos operan como el motor principal de adquisición de nuevos usuarios hacia la comunidad. El alcance operativo cubre ocho ciclos mensuales (mayo a diciembre de 2026), 150 representantes de fuerza de ventas con tablets Android, el portal público abierto al paciente, un hub interno de revisión colaborativa, y un pool de seis influencers médicos contratados vía Polar bajo estructura de brazos (tres KOLs institucionales AMG sin costo + seis influencers pagados).</w:t>
       </w:r>
     </w:p>
     <w:p>
@@ -184,7 +184,7 @@
           <w:color w:val="2C2C2C"/>
           <w:sz w:val="20"/>
         </w:rPr>
-        <w:t>Principio operativo central: la IA nunca inventa. Solo recombina, expande y adapta contenido que ya fue aprobado por Carnot y AMG. Todo el corpus clínico, todas las cifras, todos los claims y todas las referencias bibliográficas provienen del skill maestro "amg-pylori" que es la fuente única de verdad del sistema.</w:t>
+        <w:t>Principio estratégico central: el objetivo no es publicar piezas. El objetivo es construir una comunidad — el portal mexicosincancergastrico.com.mx — donde los pacientes mexicanos regresen mes con mes, apalancados en la credibilidad institucional de la AMG y en la conexión emocional que generan los influencers médicos. Las piezas de redes, la fuerza de ventas y los KOLs son el vehículo; el portal es el destino.</w:t>
       </w:r>
     </w:p>
     <w:p>
@@ -697,7 +697,69 @@
           <w:color w:val="2C2C2C"/>
           <w:sz w:val="21"/>
         </w:rPr>
-        <w:t>El resultado es un performance report mensual que condensa toda esta data en insights accionables: qué claim tuvo mayor engagement, qué variante visual convirtió mejor en cada red, qué red está subperformando contra sus benchmarks, qué KOL generó el mayor alcance orgánico en comunidad médica. Este reporte alimenta directamente las decisiones de calendario del ciclo siguiente, cerrando el loop estratégico.</w:t>
+        <w:t>El resultado es un performance report mensual que condensa toda esta data en insights accionables: qué claim tuvo mayor engagement, qué variante visual convirtió mejor en cada red, qué red está subperformando contra sus benchmarks, qué KOL generó el mayor alcance orgánico en comunidad médica, y — la métrica más importante del sistema — cuántos nuevos usuarios fueron registrados al portal mexicosincancergastrico.com.mx. Este reporte alimenta directamente las decisiones de calendario del ciclo siguiente, cerrando el loop estratégico.</w:t>
+      </w:r>
+    </w:p>
+    <w:p>
+      <w:pPr>
+        <w:spacing w:before="280" w:after="120"/>
+      </w:pPr>
+      <w:r>
+        <w:rPr>
+          <w:rFonts w:ascii="Lexend" w:hAnsi="Lexend"/>
+          <w:b/>
+          <w:color w:val="30B8B0"/>
+          <w:sz w:val="30"/>
+        </w:rPr>
+        <w:t>2.6 El portal como destino central — no como subproducto</w:t>
+      </w:r>
+    </w:p>
+    <w:p>
+      <w:pPr>
+        <w:spacing w:after="120"/>
+        <w:jc w:val="left"/>
+      </w:pPr>
+      <w:r>
+        <w:rPr>
+          <w:rFonts w:ascii="Lexend" w:hAnsi="Lexend"/>
+          <w:b w:val="0"/>
+          <w:i w:val="0"/>
+          <w:color w:val="2C2C2C"/>
+          <w:sz w:val="21"/>
+        </w:rPr>
+        <w:t>mexicosincancergastrico.com.mx no es un micrositio de campaña: es el destino permanente al que el sistema entero dirige tráfico. Todas las piezas de redes sociales, todos los posts de influencers, todos los QR de la Visita Médica y todos los materiales institucionales de la AMG apuntan a este portal con UTM de atribución. Ahí el visitante anónimo se convierte en usuario registrado y, con cada visita mensual, en miembro recurrente de la comunidad.</w:t>
+      </w:r>
+    </w:p>
+    <w:p>
+      <w:pPr>
+        <w:spacing w:after="120"/>
+        <w:jc w:val="left"/>
+      </w:pPr>
+      <w:r>
+        <w:rPr>
+          <w:rFonts w:ascii="Lexend" w:hAnsi="Lexend"/>
+          <w:b w:val="0"/>
+          <w:i w:val="0"/>
+          <w:color w:val="2C2C2C"/>
+          <w:sz w:val="21"/>
+        </w:rPr>
+        <w:t>El portal crece cíclicamente con contenido nuevo del mes: artículos educativos, casos clínicos anonimizados, testimonios de pacientes tratados, referencias bibliográficas actualizadas, y la interfaz de registro a detección gratuita que genera leads calificados para los 150 reps de fuerza de ventas. Al final de los ocho ciclos, el portal no desaparece — se convierte en el asset digital permanente que Carnot y AMG mantendrán activo durante años como referencia pública sobre H. pylori en México.</w:t>
+      </w:r>
+    </w:p>
+    <w:p>
+      <w:pPr>
+        <w:spacing w:before="160" w:after="160"/>
+        <w:ind w:left="288"/>
+        <w:shd w:val="clear" w:color="auto" w:fill="E8F5F4"/>
+      </w:pPr>
+      <w:r>
+        <w:rPr>
+          <w:rFonts w:ascii="Lexend" w:hAnsi="Lexend"/>
+          <w:i/>
+          <w:color w:val="2C2C2C"/>
+          <w:sz w:val="20"/>
+        </w:rPr>
+        <w:t>Esta es la distinción estratégica más importante del sistema versus una campaña pharma tradicional: no trabajamos en 8 oleadas de activación que se disipan al cerrar el mes. Construimos un asset digital (el portal) que capitaliza cada peso invertido en pauta y cada post de influencer como tráfico acumulativo hacia una comunidad creciente, apalancada en el aval institucional permanente de la AMG.</w:t>
       </w:r>
     </w:p>
     <w:p>
@@ -1904,7 +1966,7 @@
           <w:color w:val="183888"/>
           <w:sz w:val="44"/>
         </w:rPr>
-        <w:t>7. Rol de los influencers médicos (KOLs)</w:t>
+        <w:t>7. Influencers médicos — el motor principal de adquisición</w:t>
       </w:r>
     </w:p>
     <w:p>
@@ -1920,7 +1982,23 @@
           <w:color w:val="2C2C2C"/>
           <w:sz w:val="21"/>
         </w:rPr>
-        <w:t>Los KOLs médicos son la capa de credibilidad orgánica del sistema. Un post publicado por la cuenta institucional de Carnot tiene un alcance de marca; el mismo post publicado por el Dr. Remes-Troche tiene aproximadamente cuatro veces más alcance en la comunidad médica y, más importante, un trust premium que la cuenta de marca no puede replicar.</w:t>
+        <w:t>Los influencers médicos son el diferenciador central del sistema y el motor que convierte audiencia pasiva en comunidad activa. Un post publicado por la cuenta institucional de Carnot tiene alcance de marca; el mismo post publicado por un influencer médico tiene aproximadamente cuatro veces más alcance en la comunidad objetivo y, más importante, un trust premium que la cuenta de marca no puede comprar. Son ellos quienes llevan al paciente al portal mexicosincancergastrico.com.mx, donde se convierte en usuario de la comunidad.</w:t>
+      </w:r>
+    </w:p>
+    <w:p>
+      <w:pPr>
+        <w:spacing w:before="160" w:after="160"/>
+        <w:ind w:left="288"/>
+        <w:shd w:val="clear" w:color="auto" w:fill="E8F5F4"/>
+      </w:pPr>
+      <w:r>
+        <w:rPr>
+          <w:rFonts w:ascii="Lexend" w:hAnsi="Lexend"/>
+          <w:i/>
+          <w:color w:val="2C2C2C"/>
+          <w:sz w:val="20"/>
+        </w:rPr>
+        <w:t>El éxito del sistema no se mide por los seguidores que ganamos en redes sociales. Se mide por los usuarios nuevos registrados en el portal que regresan mes con mes. Los influencers son la fuente #1 de ese tráfico calificado, por eso operan como capa estratégica protagonista — no complementaria.</w:t>
       </w:r>
     </w:p>
     <w:p>
@@ -1934,7 +2012,7 @@
           <w:color w:val="30B8B0"/>
           <w:sz w:val="30"/>
         </w:rPr>
-        <w:t>7.1 Selección y perfil</w:t>
+        <w:t>7.1 Estructura del pool — tres brazos</w:t>
       </w:r>
     </w:p>
     <w:p>
@@ -1950,7 +2028,7 @@
           <w:color w:val="2C2C2C"/>
           <w:sz w:val="21"/>
         </w:rPr>
-        <w:t>El pool de KOLs se estructura en tres tiers:</w:t>
+        <w:t>El pool está organizado en dos brazos operativos diferentes:</w:t>
       </w:r>
     </w:p>
     <w:p>
@@ -1964,7 +2042,7 @@
           <w:color w:val="183888"/>
           <w:sz w:val="24"/>
         </w:rPr>
-        <w:t>Tier 1 — KOLs senior HCP</w:t>
+        <w:t>Brazo institucional AMG (3 KOLs, sin costo, convenio Polar-AMG)</w:t>
       </w:r>
     </w:p>
     <w:p>
@@ -1980,7 +2058,52 @@
           <w:color w:val="2C2C2C"/>
           <w:sz w:val="21"/>
         </w:rPr>
-        <w:t>Médicos con reconocimiento nacional en gastroenterología o medicina interna, presencia activa en LinkedIn y X, y relación histórica con Carnot o AMG. Para el piloto: Dr. José María Remes-Troche, Dra. Luisa Valdovinos, Dr. Ramón Coss Adame. Audiencia: HCP especialistas y generalistas. Pack mensual: 1 post LinkedIn + 1 hilo X + 1 video corto desde consultorio + participación en webinar trimestral.</w:t>
+        <w:t>Participan por virtud del convenio con la Asociación Mexicana de Gastroenterología. No son contratados como influencers ni reciben honorarios — su participación es institucional y avala científicamente el contenido. Aparecen únicamente en materiales con marca (brazo Ki-CAB).</w:t>
+      </w:r>
+    </w:p>
+    <w:p>
+      <w:pPr>
+        <w:pStyle w:val="ListBullet"/>
+        <w:spacing w:after="60"/>
+        <w:ind w:left="432"/>
+      </w:pPr>
+      <w:r>
+        <w:rPr>
+          <w:rFonts w:ascii="Lexend" w:hAnsi="Lexend"/>
+          <w:color w:val="2C2C2C"/>
+          <w:sz w:val="21"/>
+        </w:rPr>
+        <w:t>**Dra. Alejandra Noble** — Presidenta de la AMG A.C. Aval institucional del hub público. Su nombre y cargo se citan textualmente en los materiales AMG sin marca.</w:t>
+      </w:r>
+    </w:p>
+    <w:p>
+      <w:pPr>
+        <w:pStyle w:val="ListBullet"/>
+        <w:spacing w:after="60"/>
+        <w:ind w:left="432"/>
+      </w:pPr>
+      <w:r>
+        <w:rPr>
+          <w:rFonts w:ascii="Lexend" w:hAnsi="Lexend"/>
+          <w:color w:val="2C2C2C"/>
+          <w:sz w:val="21"/>
+        </w:rPr>
+        <w:t>**Dr. Luis Raúl Valdovinos** — Secretario de la AMG. Aval de eficacia de erradicación con atribución fija: "Ki-CAB® (Tegoprazán) logra tasas de erradicación de H. pylori superiores al 90%." Aparece solo en materiales HCP con marca.</w:t>
+      </w:r>
+    </w:p>
+    <w:p>
+      <w:pPr>
+        <w:pStyle w:val="ListBullet"/>
+        <w:spacing w:after="60"/>
+        <w:ind w:left="432"/>
+      </w:pPr>
+      <w:r>
+        <w:rPr>
+          <w:rFonts w:ascii="Lexend" w:hAnsi="Lexend"/>
+          <w:color w:val="2C2C2C"/>
+          <w:sz w:val="21"/>
+        </w:rPr>
+        <w:t>**Dr. Enrique Coss Adame** — Coordinador del Laboratorio de Motilidad GI de la AMG. Aval de efectividad frente a cepas resistentes con atribución fija: "Ki-CAB® (Tegoprazán) potencia la acción de antibióticos frente a cepas resistentes de H. pylori." Aparece solo en materiales HCP con marca.</w:t>
       </w:r>
     </w:p>
     <w:p>
@@ -1994,7 +2117,7 @@
           <w:color w:val="183888"/>
           <w:sz w:val="24"/>
         </w:rPr>
-        <w:t>Tier 2 — Divulgadores médicos masivos</w:t>
+        <w:t>Brazo de influencers pagados (6 perfiles, contratación Polar, brazo sin marca)</w:t>
       </w:r>
     </w:p>
     <w:p>
@@ -2010,7 +2133,7 @@
           <w:color w:val="2C2C2C"/>
           <w:sz w:val="21"/>
         </w:rPr>
-        <w:t>Médicos con alta visibilidad en TikTok e Instagram, audiencia mayoritaria paciente joven y adulto. Por definir en reclutamiento (figura tipo Dr. Vic, Dra. Isa Zapata). Pack mensual: 2 TikToks + 2 YouTube Shorts + 1 colaboración con paciente real en formato entrevista controlada.</w:t>
+        <w:t>Todos operan bajo el Brazo Sin Marca — hablan de H. pylori, prevención y diagnóstico, pero NUNCA mencionan Ki-CAB ni Carnot. Carnot paga, pero la contratación visible es a través de Polar Multimedia, lo que preserva la integridad editorial del influencer y la distancia regulatoria requerida. Todos llevan al paciente al portal mexicosincancergastrico.com.mx con UTM único por influencer para medición atribuida.</w:t>
       </w:r>
     </w:p>
     <w:p>
@@ -2024,7 +2147,7 @@
           <w:color w:val="183888"/>
           <w:sz w:val="24"/>
         </w:rPr>
-        <w:t>Tier 3 — Personal de atención primaria</w:t>
+        <w:t>Tier 1 (dos influencers · audiencia masiva paciente)</w:t>
       </w:r>
     </w:p>
     <w:p>
@@ -2040,21 +2163,7 @@
           <w:color w:val="2C2C2C"/>
           <w:sz w:val="21"/>
         </w:rPr>
-        <w:t>Enfermeras divulgadoras y médicos de primer contacto con audiencia de paciente femenino adulto. Rol: testimonio de campo, validación práctica del mensaje. Pack mensual: 2 posts Facebook/Instagram + 3 Stories + un testimonio de campo.</w:t>
-      </w:r>
-    </w:p>
-    <w:p>
-      <w:pPr>
-        <w:spacing w:before="280" w:after="120"/>
-      </w:pPr>
-      <w:r>
-        <w:rPr>
-          <w:rFonts w:ascii="Lexend" w:hAnsi="Lexend"/>
-          <w:b/>
-          <w:color w:val="30B8B0"/>
-          <w:sz w:val="30"/>
-        </w:rPr>
-        <w:t>7.2 Pack de ciclo</w:t>
+        <w:t>**@doctormiguelpadilla** — Médico general/familiar, 100K+ seguidores, contenido didáctico y cercano. Audiencia de pacientes y cuidadores con alta identificación con casos de "gastritis de toda la vida". Formato principal: Reels/TikTok explicativo de 2-3 min. Eje editorial del ciclo: "Por qué la gastritis recurrente merece una segunda opinión." Pack mensual: 2 Reels + 3 Stories sobre H. pylori y detección. Compensación sugerida a negociar: USD equivalente MXN $25,000 a $40,000 mensuales.</w:t>
       </w:r>
     </w:p>
     <w:p>
@@ -2070,96 +2179,21 @@
           <w:color w:val="2C2C2C"/>
           <w:sz w:val="21"/>
         </w:rPr>
-        <w:t>Cada KOL recibe mensualmente, vía URL privada desde el hub sistema_piezas, un pack que contiene:</w:t>
+        <w:t>**@pologuerrero.med** — Médico con contenido de salud con humor y formato trending, 80K+ seguidores. Audiencia adultos jóvenes 25-40, preventivos, alto engagement. Formato principal: TikTok con gancho "¿Tienes esto?". Eje editorial: "7 de cada 10 mexicanos la tienen y no lo saben." Pack mensual: 2 TikToks + 2 Reels. Compensación sugerida: MXN $20,000 a $35,000 mensuales.</w:t>
       </w:r>
     </w:p>
     <w:p>
       <w:pPr>
-        <w:pStyle w:val="ListBullet"/>
-        <w:spacing w:after="60"/>
-        <w:ind w:left="432"/>
-      </w:pPr>
-      <w:r>
-        <w:rPr>
-          <w:rFonts w:ascii="Lexend" w:hAnsi="Lexend"/>
-          <w:color w:val="2C2C2C"/>
-          <w:sz w:val="21"/>
-        </w:rPr>
-        <w:t>Brief clínico del ciclo con las dos o tres referencias bibliográficas clave.</w:t>
-      </w:r>
-    </w:p>
-    <w:p>
-      <w:pPr>
-        <w:pStyle w:val="ListBullet"/>
-        <w:spacing w:after="60"/>
-        <w:ind w:left="432"/>
-      </w:pPr>
-      <w:r>
-        <w:rPr>
-          <w:rFonts w:ascii="Lexend" w:hAnsi="Lexend"/>
-          <w:color w:val="2C2C2C"/>
-          <w:sz w:val="21"/>
-        </w:rPr>
-        <w:t>Copy sugerido en la voz personal del KOL, con variantes para cada plataforma donde publica.</w:t>
-      </w:r>
-    </w:p>
-    <w:p>
-      <w:pPr>
-        <w:pStyle w:val="ListBullet"/>
-        <w:spacing w:after="60"/>
-        <w:ind w:left="432"/>
-      </w:pPr>
-      <w:r>
-        <w:rPr>
-          <w:rFonts w:ascii="Lexend" w:hAnsi="Lexend"/>
-          <w:color w:val="2C2C2C"/>
-          <w:sz w:val="21"/>
-        </w:rPr>
-        <w:t>Artes listas para publicar desde su cuenta con la paleta ligada a campaña: paleta navy-teal-dorado, sello AMG visible, hashtag #MéxicoSinCáncerGástrico.</w:t>
-      </w:r>
-    </w:p>
-    <w:p>
-      <w:pPr>
-        <w:pStyle w:val="ListBullet"/>
-        <w:spacing w:after="60"/>
-        <w:ind w:left="432"/>
-      </w:pPr>
-      <w:r>
-        <w:rPr>
-          <w:rFonts w:ascii="Lexend" w:hAnsi="Lexend"/>
-          <w:color w:val="2C2C2C"/>
-          <w:sz w:val="21"/>
-        </w:rPr>
-        <w:t>Video introductorio de treinta segundos grabado por Carnot con contextualización del mes.</w:t>
-      </w:r>
-    </w:p>
-    <w:p>
-      <w:pPr>
-        <w:pStyle w:val="ListBullet"/>
-        <w:spacing w:after="60"/>
-        <w:ind w:left="432"/>
-      </w:pPr>
-      <w:r>
-        <w:rPr>
-          <w:rFonts w:ascii="Lexend" w:hAnsi="Lexend"/>
-          <w:color w:val="2C2C2C"/>
-          <w:sz w:val="21"/>
-        </w:rPr>
-        <w:t>Guía de tres escenarios de conversación con pacientes/colegas para prepararse ante preguntas.</w:t>
-      </w:r>
-    </w:p>
-    <w:p>
-      <w:pPr>
-        <w:spacing w:before="280" w:after="120"/>
+        <w:spacing w:before="200" w:after="80"/>
       </w:pPr>
       <w:r>
         <w:rPr>
           <w:rFonts w:ascii="Lexend" w:hAnsi="Lexend"/>
           <w:b/>
-          <w:color w:val="30B8B0"/>
-          <w:sz w:val="30"/>
+          <w:color w:val="183888"/>
+          <w:sz w:val="24"/>
         </w:rPr>
-        <w:t>7.3 Compliance y auditoría</w:t>
+        <w:t>Tier 2 (un influencer · credibilidad médica especializada)</w:t>
       </w:r>
     </w:p>
     <w:p>
@@ -2175,21 +2209,21 @@
           <w:color w:val="2C2C2C"/>
           <w:sz w:val="21"/>
         </w:rPr>
-        <w:t>Todos los contratos KOL incluyen cláusula de compliance pharma (NOM-220-SSA1-2016, regulación COFEPRIS sobre promoción de medicamentos, autoregulación CETIFARMA), identificación visible de posts comerciales con hashtags #publicidad o #patrocinado cuando aplica, y derecho de auditoría post-publicación por parte del comité AMG. El KOL firma contrato directamente con Carnot; Polar opera como facilitador operativo y entrega el pack.</w:t>
+        <w:t>**@drasuarezgastro** — Gastroenteróloga, 30K-60K seguidores, audiencia mixta HCP + pacientes. Su presencia permite hibridar mensajes para médico y paciente con alta credibilidad clínica. Formato principal: carrusel educativo en Instagram + Reel explicativo. Eje editorial: "Lo que tu gastroenterólogo quiere que sepas sobre H. pylori." Pack mensual: 2 posts (carrusel + Reel). Compensación sugerida: MXN $10,000 a $18,000 mensuales. Valor adicional: puede activarse también en contenido gated HCP con formato profesional separado.</w:t>
       </w:r>
     </w:p>
     <w:p>
       <w:pPr>
-        <w:spacing w:before="280" w:after="120"/>
+        <w:spacing w:before="200" w:after="80"/>
       </w:pPr>
       <w:r>
         <w:rPr>
           <w:rFonts w:ascii="Lexend" w:hAnsi="Lexend"/>
           <w:b/>
-          <w:color w:val="30B8B0"/>
-          <w:sz w:val="30"/>
+          <w:color w:val="183888"/>
+          <w:sz w:val="24"/>
         </w:rPr>
-        <w:t>7.4 Métricas propias de los KOLs</w:t>
+        <w:t>Tier 3 (dos influencers · audiencia específica)</w:t>
       </w:r>
     </w:p>
     <w:p>
@@ -2205,7 +2239,53 @@
           <w:color w:val="2C2C2C"/>
           <w:sz w:val="21"/>
         </w:rPr>
-        <w:t>Los KOLs se miden por separado del performance de las cuentas de marca:</w:t>
+        <w:t>**@doclaurasalazar** — Médica especialista en salud preventiva, 15K-30K seguidores, comunidad principalmente femenina de 30-50 años con interés en salud familiar. Formato principal: Stories + Reel corto de 60 segundos. Eje editorial: "La bacteria que pasa de mamá a hijos — lo que debes saber." Pack mensual: 3 Stories + 1 Reel. Compensación sugerida: MXN $5,000 a $10,000 mensuales.</w:t>
+      </w:r>
+    </w:p>
+    <w:p>
+      <w:pPr>
+        <w:spacing w:after="120"/>
+        <w:jc w:val="left"/>
+      </w:pPr>
+      <w:r>
+        <w:rPr>
+          <w:rFonts w:ascii="Lexend" w:hAnsi="Lexend"/>
+          <w:b w:val="0"/>
+          <w:i w:val="0"/>
+          <w:color w:val="2C2C2C"/>
+          <w:sz w:val="21"/>
+        </w:rPr>
+        <w:t>**@doctorvic** — Médico con audiencia joven en formato entretenido y viral, 20K-40K seguidores, millennials y GenZ que se informan de salud en TikTok. Formato principal: TikTok duet/stitch con cifras sorpresa. Eje editorial: "La prueba de aliento que deberías hacerte hoy — y ni sabías que existía." Pack mensual: 2 TikToks. Compensación sugerida: MXN $5,000 a $8,000 mensuales.</w:t>
+      </w:r>
+    </w:p>
+    <w:p>
+      <w:pPr>
+        <w:spacing w:before="280" w:after="120"/>
+      </w:pPr>
+      <w:r>
+        <w:rPr>
+          <w:rFonts w:ascii="Lexend" w:hAnsi="Lexend"/>
+          <w:b/>
+          <w:color w:val="30B8B0"/>
+          <w:sz w:val="30"/>
+        </w:rPr>
+        <w:t>7.2 Pack de ciclo — qué recibe cada influencer</w:t>
+      </w:r>
+    </w:p>
+    <w:p>
+      <w:pPr>
+        <w:spacing w:after="120"/>
+        <w:jc w:val="left"/>
+      </w:pPr>
+      <w:r>
+        <w:rPr>
+          <w:rFonts w:ascii="Lexend" w:hAnsi="Lexend"/>
+          <w:b w:val="0"/>
+          <w:i w:val="0"/>
+          <w:color w:val="2C2C2C"/>
+          <w:sz w:val="21"/>
+        </w:rPr>
+        <w:t>Cada influencer recibe mensualmente, vía URL privada única desde el hub interno de revisión, un pack consolidado que resuelve el 80% de su trabajo creativo:</w:t>
       </w:r>
     </w:p>
     <w:p>
@@ -2220,7 +2300,7 @@
           <w:color w:val="2C2C2C"/>
           <w:sz w:val="21"/>
         </w:rPr>
-        <w:t>Alcance orgánico por post: target 30 mil+ en Tier 1, 75 mil+ en Tier 2.</w:t>
+        <w:t>Brief clínico del ciclo con las dos o tres referencias bibliográficas clave, redactado en lenguaje accesible para que él o ella lo adapten a su voz.</w:t>
       </w:r>
     </w:p>
     <w:p>
@@ -2235,7 +2315,7 @@
           <w:color w:val="2C2C2C"/>
           <w:sz w:val="21"/>
         </w:rPr>
-        <w:t>Engagement diferenciado entre audiencia HCP y paciente (determinado por análisis cualitativo de comentarios).</w:t>
+        <w:t>Copy sugerido en la voz personal del influencer (Claude lo pre-adapta con el tono de cada cuenta), con variantes por plataforma donde publica habitualmente.</w:t>
       </w:r>
     </w:p>
     <w:p>
@@ -2250,7 +2330,7 @@
           <w:color w:val="2C2C2C"/>
           <w:sz w:val="21"/>
         </w:rPr>
-        <w:t>Citación por otros KOLs o profesionales (proxy de reputación).</w:t>
+        <w:t>Artes listas para publicar directamente desde su cuenta con la paleta ligada a campaña (navy-teal-dorado), sello AMG visible, hashtag oficial #MéxicoSinCáncerGástrico.</w:t>
       </w:r>
     </w:p>
     <w:p>
@@ -2265,7 +2345,202 @@
           <w:color w:val="2C2C2C"/>
           <w:sz w:val="21"/>
         </w:rPr>
-        <w:t>Conversiones asignadas mediante links UTM únicos por KOL en landing page de detección.</w:t>
+        <w:t>Video introductorio de treinta segundos grabado por dirección médica de Carnot con contextualización del tema del mes — utilizable como referencia interna o fragmento.</w:t>
+      </w:r>
+    </w:p>
+    <w:p>
+      <w:pPr>
+        <w:pStyle w:val="ListBullet"/>
+        <w:spacing w:after="60"/>
+        <w:ind w:left="432"/>
+      </w:pPr>
+      <w:r>
+        <w:rPr>
+          <w:rFonts w:ascii="Lexend" w:hAnsi="Lexend"/>
+          <w:color w:val="2C2C2C"/>
+          <w:sz w:val="21"/>
+        </w:rPr>
+        <w:t>Guía de tres escenarios de conversación con pacientes o colegas que pueden presentarse como comentarios o preguntas en sus posts.</w:t>
+      </w:r>
+    </w:p>
+    <w:p>
+      <w:pPr>
+        <w:pStyle w:val="ListBullet"/>
+        <w:spacing w:after="60"/>
+        <w:ind w:left="432"/>
+      </w:pPr>
+      <w:r>
+        <w:rPr>
+          <w:rFonts w:ascii="Lexend" w:hAnsi="Lexend"/>
+          <w:color w:val="2C2C2C"/>
+          <w:sz w:val="21"/>
+        </w:rPr>
+        <w:t>Link UTM único por influencer que lleva al portal mexicosincancergastrico.com.mx con parámetros de atribución para medir conversiones propias.</w:t>
+      </w:r>
+    </w:p>
+    <w:p>
+      <w:pPr>
+        <w:spacing w:before="280" w:after="120"/>
+      </w:pPr>
+      <w:r>
+        <w:rPr>
+          <w:rFonts w:ascii="Lexend" w:hAnsi="Lexend"/>
+          <w:b/>
+          <w:color w:val="30B8B0"/>
+          <w:sz w:val="30"/>
+        </w:rPr>
+        <w:t>7.3 Amplificación con Spark Ads (TikTok)</w:t>
+      </w:r>
+    </w:p>
+    <w:p>
+      <w:pPr>
+        <w:spacing w:after="120"/>
+        <w:jc w:val="left"/>
+      </w:pPr>
+      <w:r>
+        <w:rPr>
+          <w:rFonts w:ascii="Lexend" w:hAnsi="Lexend"/>
+          <w:b w:val="0"/>
+          <w:i w:val="0"/>
+          <w:color w:val="2C2C2C"/>
+          <w:sz w:val="21"/>
+        </w:rPr>
+        <w:t>El mayor retorno de inversión del presupuesto TikTok viene de usar el contenido de los influencers como Spark Ads — es decir, amplificar con pauta el contenido orgánico del influencer desde su propia cuenta, no desde la cuenta de la marca. El contenido aparece como orgánico del influencer lo que genera más confianza, la audiencia del influencer se suma a la audiencia propia del anuncio, las métricas se dividen entre engagement orgánico y reach pago, y los CTR y CPM mejoran significativamente versus Dark Posts de marca.</w:t>
+      </w:r>
+    </w:p>
+    <w:p>
+      <w:pPr>
+        <w:spacing w:before="280" w:after="120"/>
+      </w:pPr>
+      <w:r>
+        <w:rPr>
+          <w:rFonts w:ascii="Lexend" w:hAnsi="Lexend"/>
+          <w:b/>
+          <w:color w:val="30B8B0"/>
+          <w:sz w:val="30"/>
+        </w:rPr>
+        <w:t>7.4 Compliance y auditoría</w:t>
+      </w:r>
+    </w:p>
+    <w:p>
+      <w:pPr>
+        <w:spacing w:after="120"/>
+        <w:jc w:val="left"/>
+      </w:pPr>
+      <w:r>
+        <w:rPr>
+          <w:rFonts w:ascii="Lexend" w:hAnsi="Lexend"/>
+          <w:b w:val="0"/>
+          <w:i w:val="0"/>
+          <w:color w:val="2C2C2C"/>
+          <w:sz w:val="21"/>
+        </w:rPr>
+        <w:t>Todos los contratos de influencer incluyen cláusula explícita de compliance pharma con NOM-220-SSA1-2016, regulación COFEPRIS sobre promoción de medicamentos y autoregulación CETIFARMA. Obligación de identificación visible de posts comerciales con hashtags #publicidad o #patrocinado donde aplique. Derecho de auditoría post-publicación por parte del comité AMG. Los KOLs AMG institucionales operan bajo convenio separado Polar-AMG sin cláusulas comerciales.</w:t>
+      </w:r>
+    </w:p>
+    <w:p>
+      <w:pPr>
+        <w:spacing w:before="280" w:after="120"/>
+      </w:pPr>
+      <w:r>
+        <w:rPr>
+          <w:rFonts w:ascii="Lexend" w:hAnsi="Lexend"/>
+          <w:b/>
+          <w:color w:val="30B8B0"/>
+          <w:sz w:val="30"/>
+        </w:rPr>
+        <w:t>7.5 Métricas propias y atribución al portal</w:t>
+      </w:r>
+    </w:p>
+    <w:p>
+      <w:pPr>
+        <w:spacing w:after="120"/>
+        <w:jc w:val="left"/>
+      </w:pPr>
+      <w:r>
+        <w:rPr>
+          <w:rFonts w:ascii="Lexend" w:hAnsi="Lexend"/>
+          <w:b w:val="0"/>
+          <w:i w:val="0"/>
+          <w:color w:val="2C2C2C"/>
+          <w:sz w:val="21"/>
+        </w:rPr>
+        <w:t>Los influencers se miden con vectores distintos al de las cuentas de marca, enfocados en la misión de llevar usuarios al portal:</w:t>
+      </w:r>
+    </w:p>
+    <w:p>
+      <w:pPr>
+        <w:pStyle w:val="ListBullet"/>
+        <w:spacing w:after="60"/>
+        <w:ind w:left="432"/>
+      </w:pPr>
+      <w:r>
+        <w:rPr>
+          <w:rFonts w:ascii="Lexend" w:hAnsi="Lexend"/>
+          <w:color w:val="2C2C2C"/>
+          <w:sz w:val="21"/>
+        </w:rPr>
+        <w:t>**Tráfico atribuido al portal** (UTM único por influencer): objetivo mensual de mil visitas nuevas por cuenta Tier 1, 400 por Tier 2, 200 por Tier 3.</w:t>
+      </w:r>
+    </w:p>
+    <w:p>
+      <w:pPr>
+        <w:pStyle w:val="ListBullet"/>
+        <w:spacing w:after="60"/>
+        <w:ind w:left="432"/>
+      </w:pPr>
+      <w:r>
+        <w:rPr>
+          <w:rFonts w:ascii="Lexend" w:hAnsi="Lexend"/>
+          <w:color w:val="2C2C2C"/>
+          <w:sz w:val="21"/>
+        </w:rPr>
+        <w:t>**Registros a detección gratuita** atribuidos al UTM del influencer (conversión más importante de todo el sistema).</w:t>
+      </w:r>
+    </w:p>
+    <w:p>
+      <w:pPr>
+        <w:pStyle w:val="ListBullet"/>
+        <w:spacing w:after="60"/>
+        <w:ind w:left="432"/>
+      </w:pPr>
+      <w:r>
+        <w:rPr>
+          <w:rFonts w:ascii="Lexend" w:hAnsi="Lexend"/>
+          <w:color w:val="2C2C2C"/>
+          <w:sz w:val="21"/>
+        </w:rPr>
+        <w:t>**Alcance orgánico por post**: benchmark 30 mil por post Tier 1, 60 mil por post Tier 2 con Spark Ads, 20 mil por post Tier 3.</w:t>
+      </w:r>
+    </w:p>
+    <w:p>
+      <w:pPr>
+        <w:pStyle w:val="ListBullet"/>
+        <w:spacing w:after="60"/>
+        <w:ind w:left="432"/>
+      </w:pPr>
+      <w:r>
+        <w:rPr>
+          <w:rFonts w:ascii="Lexend" w:hAnsi="Lexend"/>
+          <w:color w:val="2C2C2C"/>
+          <w:sz w:val="21"/>
+        </w:rPr>
+        <w:t>**Engagement médico diferenciado** (análisis cualitativo de comentarios para detectar interacciones de otros profesionales de la salud).</w:t>
+      </w:r>
+    </w:p>
+    <w:p>
+      <w:pPr>
+        <w:pStyle w:val="ListBullet"/>
+        <w:spacing w:after="60"/>
+        <w:ind w:left="432"/>
+      </w:pPr>
+      <w:r>
+        <w:rPr>
+          <w:rFonts w:ascii="Lexend" w:hAnsi="Lexend"/>
+          <w:color w:val="2C2C2C"/>
+          <w:sz w:val="21"/>
+        </w:rPr>
+        <w:t>**Citación por otros KOLs** (proxy de reputación, no directamente accionable pero indicador de health de la estrategia).</w:t>
       </w:r>
     </w:p>
     <w:p>

</xml_diff>